<commit_message>
Présentation du modèle aux couleurs Banque Populaire, avec deux exemples de notation
Charte du support COPIL (orange, photo et logo) appliquée aux sept
diapositives ; ajout d'une diapositive comparant la centrale solaire
(AA) et l'usine de dessalement (BB), et de la section du discours.

Co-Authored-By: Claude Opus 5.5 <noreply@anthropic.com>
Claude-Session: https://claude.ai/code/session_019wSxNNAdZ9X5Q51BQYkAf8
</commit_message>
<xml_diff>
--- a/docs/formation/Discours_modele_scoring_PF.docx
+++ b/docs/formation/Discours_modele_scoring_PF.docx
@@ -879,6 +879,97 @@
           <w:i/>
           <w:iCs/>
         </w:rPr>
+        <w:t xml:space="preserve">Voyons le modèle à l’œuvre sur deux cas fictifs.</w:t>
+      </w:r>
+    </w:p>
+    <w:p>
+      <w:pPr>
+        <w:pStyle w:val="Heading1"/>
+      </w:pPr>
+      <w:r>
+        <w:t xml:space="preserve">8. Deux exemples : solaire et dessalement</w:t>
+      </w:r>
+    </w:p>
+    <w:p>
+      <w:pPr>
+        <w:spacing w:after="100"/>
+      </w:pPr>
+      <w:r>
+        <w:rPr>
+          <w:b/>
+          <w:bCs/>
+          <w:color w:val="B8862E"/>
+        </w:rPr>
+        <w:t xml:space="preserve">Diapositive 8</w:t>
+      </w:r>
+      <w:r>
+        <w:rPr>
+          <w:i/>
+          <w:iCs/>
+          <w:color w:val="3D4A5C"/>
+        </w:rPr>
+        <w:t xml:space="preserve">   ·   environ 2 minutes</w:t>
+      </w:r>
+    </w:p>
+    <w:p>
+      <w:pPr>
+        <w:spacing w:after="140" w:line="300"/>
+      </w:pPr>
+      <w:r>
+        <w:rPr>
+          <w:b/>
+          <w:bCs/>
+        </w:rPr>
+        <w:t xml:space="preserve">Centrale solaire de 80 MWc, en construction. </w:t>
+      </w:r>
+      <w:r>
+        <w:t xml:space="preserve">Les recettes sont garanties par un contrat d’achat de 25 ans à quantité garantie (régime take-or-pay). Le DSCR minimum atteint 1,30 pour un seuil favorable de 1,25 ; en scénario défavorable, production P90 et charges en hausse de 10 %, il reste à 1,12, en vigilance. La dette représente 66 % du financement. Aucun plafond ne se déclenche : le score de 86,3 donne une note de 9, soit AA, avec des conditions minimales.</w:t>
+      </w:r>
+    </w:p>
+    <w:p>
+      <w:pPr>
+        <w:spacing w:after="140" w:line="300"/>
+      </w:pPr>
+      <w:r>
+        <w:rPr>
+          <w:b/>
+          <w:bCs/>
+        </w:rPr>
+        <w:t xml:space="preserve">Usine de dessalement de 100 000 m³ par jour, en montée en charge. </w:t>
+      </w:r>
+      <w:r>
+        <w:t xml:space="preserve">Elle est rémunérée par une redevance de disponibilité, mais 35 % de la dette est en euros et l’opération est consortiale, au sens de la directive 3/W/2025. Le DSCR minimum de 1,23 est sous le seuil de vigilance de 1,27 ; en scénario défavorable (énergie en hausse de 15 %, répercutée à 60 % seulement), il tombe à 1,09, en zone critique. Le score de 67,7 donne une note de 6, soit BB : le dossier est acceptable, sous conditions, notamment une couverture de change et une réserve de service de la dette renforcée.</w:t>
+      </w:r>
+    </w:p>
+    <w:p>
+      <w:pPr>
+        <w:spacing w:after="140" w:line="300"/>
+      </w:pPr>
+      <w:r>
+        <w:t xml:space="preserve">Le contraste est instructif : deux projets d’infrastructure, deux structures de recettes, et le modèle explique précisément pourquoi l’un est AA et l’autre BB.</w:t>
+      </w:r>
+    </w:p>
+    <w:p>
+      <w:pPr>
+        <w:pBdr>
+          <w:left w:val="single" w:color="B8862E" w:sz="12" w:space="8"/>
+        </w:pBdr>
+        <w:spacing w:after="240" w:before="120"/>
+        <w:ind w:left="160"/>
+      </w:pPr>
+      <w:r>
+        <w:rPr>
+          <w:b/>
+          <w:bCs/>
+          <w:color w:val="B8862E"/>
+        </w:rPr>
+        <w:t xml:space="preserve">Transition — </w:t>
+      </w:r>
+      <w:r>
+        <w:rPr>
+          <w:i/>
+          <w:iCs/>
+        </w:rPr>
         <w:t xml:space="preserve">Pour conclure…</w:t>
       </w:r>
     </w:p>
@@ -900,7 +991,7 @@
           <w:bCs/>
           <w:color w:val="B8862E"/>
         </w:rPr>
-        <w:t xml:space="preserve">Diapositive 7 (suite)</w:t>
+        <w:t xml:space="preserve">Diapositive 8 (suite)</w:t>
       </w:r>
       <w:r>
         <w:rPr>

</xml_diff>

<commit_message>
Documents mis à jour : volet climatique, stress test, IA et outil Excel v4
- Pièces des 18 cas : fiche climat (aléas, transition, scénario) dans
  la synthèse EIES et le rapport de l'ingénieur ; banc IA : le lecteur
  retrouve les 185 champs climat des 18 cas.
- Formation : présentation (10 diapositives) et discours, CR COPIL,
  guide de saisie, questionnaire des experts (136 questions), note
  stress test, proposition climat et dossier de validation du lot 2.
- Présentation détaillée aux experts (41 diapositives) et son discours ;
  docs/modele-pf-web.md.

Co-Authored-By: Claude Opus 5.5 <noreply@anthropic.com>
Claude-Session: https://claude.ai/code/session_019wSxNNAdZ9X5Q51BQYkAf8
</commit_message>
<xml_diff>
--- a/docs/formation/Discours_modele_scoring_PF.docx
+++ b/docs/formation/Discours_modele_scoring_PF.docx
@@ -29,7 +29,7 @@
           <w:sz w:val="28"/>
           <w:szCs w:val="28"/>
         </w:rPr>
-        <w:t xml:space="preserve">Discours de présentation — 7 diapositives, environ 15 minutes</w:t>
+        <w:t xml:space="preserve">Discours de présentation — 10 diapositives, environ 20 minutes</w:t>
       </w:r>
     </w:p>
     <w:p>
@@ -52,7 +52,7 @@
         <w:t xml:space="preserve">Conseils de présentation. </w:t>
       </w:r>
       <w:r>
-        <w:t xml:space="preserve">Comptez environ deux minutes par diapositive et gardez du temps pour les questions. Les chiffres présentés (poids, seuils, plafonds) sont les paramètres candidats du modèle : dites-le, pour que la discussion porte sur leur calibrage plutôt que sur leur caractère définitif.</w:t>
+        <w:t xml:space="preserve">Comptez environ deux minutes par diapositive et gardez du temps pour les questions. Les chiffres présentés (poids, seuils, plafonds, scénarios de stress, paramètres du volet climatique) sont les paramètres candidats du modèle : dites-le, pour que la discussion porte sur leur calibrage plutôt que sur leur caractère définitif. Les cas cités sont fictifs.</w:t>
       </w:r>
     </w:p>
     <w:p>
@@ -113,7 +113,7 @@
         <w:spacing w:after="140" w:line="300"/>
       </w:pPr>
       <w:r>
-        <w:t xml:space="preserve">Je commencerai par la question de fond : pourquoi noter un financement de projet est un exercice à part, en particulier au Maroc. Je dirai ensuite ce que le modèle apporte concrètement, avant d’entrer dans son fonctionnement.</w:t>
+        <w:t xml:space="preserve">Je commencerai par la question de fond : pourquoi noter un financement de projet est un exercice à part, en particulier au Maroc. Je dirai ensuite ce que le modèle apporte concrètement, avant d’entrer dans son fonctionnement. Cette version intègre deux évolutions récentes : une bibliothèque de scénarios de stress par secteur, avec le calcul du choc, et un volet climatique en deux lots.</w:t>
       </w:r>
     </w:p>
     <w:p>
@@ -186,40 +186,40 @@
           <w:b/>
           <w:bCs/>
         </w:rPr>
-        <w:t xml:space="preserve">Or un financement de projet est difficile à noter, pour trois raisons. </w:t>
-      </w:r>
-      <w:r>
-        <w:t xml:space="preserve">La première : l’emprunteur est une société de projet créée pour l’occasion. Elle n’a ni historique ni bilan ; les ratios habituels d’une analyse d’entreprise n’ont pas de prise sur elle. La deuxième : la banque est remboursée par les seuls flux du projet, sur quinze ou vingt ans, et non par la solidité d’un groupe. La troisième : les risques changent avec la vie du projet. En construction, la question est de savoir si l’ouvrage sera livré à temps et au coût prévu ; en exploitation, elle devient celle des recettes, de la performance et des contreparties.</w:t>
-      </w:r>
-    </w:p>
-    <w:p>
-      <w:pPr>
-        <w:spacing w:after="140" w:line="300"/>
-      </w:pPr>
-      <w:r>
-        <w:rPr>
-          <w:b/>
-          <w:bCs/>
-        </w:rPr>
-        <w:t xml:space="preserve">Nos pratiques, ensuite, gagnent à être consolidées. </w:t>
-      </w:r>
-      <w:r>
-        <w:t xml:space="preserve">Nous utilisons souvent des grilles conçues pour des entreprises, peu adaptées à ces dossiers. Le jugement d’expert reste central, et c’est une force, mais il est peu standardisé : deux analystes peuvent aboutir à deux notes différentes sur le même dossier, et il devient difficile de comparer une centrale solaire à une autoroute ou à un hôpital. Enfin, la justification de la note et sa traçabilité varient d’un dossier à l’autre.</w:t>
-      </w:r>
-    </w:p>
-    <w:p>
-      <w:pPr>
-        <w:spacing w:after="140" w:line="300"/>
-      </w:pPr>
-      <w:r>
-        <w:rPr>
-          <w:b/>
-          <w:bCs/>
-        </w:rPr>
-        <w:t xml:space="preserve">Enfin, les exigences montent. </w:t>
-      </w:r>
-      <w:r>
-        <w:t xml:space="preserve">Le cadre bâlois fixe des critères précis pour la notation du financement de projet. Bank Al-Maghrib a publié des textes récents qui concernent directement ces dossiers, notamment sur la consortialisation des crédits et sur les risques climatiques des grands emprunteurs ; leur portée exacte est à confirmer avec la Conformité. Et les bailleurs internationaux qui cofinancent nos projets attendent le respect des normes environnementales et sociales de la SFI et de la BERD.</w:t>
+        <w:t xml:space="preserve">Or un financement de projet est difficile à noter, pour trois raisons.</w:t>
+      </w:r>
+      <w:r>
+        <w:t xml:space="preserve"> La première : l’emprunteur est une société de projet créée pour l’occasion. Elle n’a ni historique ni bilan ; les ratios habituels d’une analyse d’entreprise n’ont pas de prise sur elle. La deuxième : la banque est remboursée par les seuls flux du projet, sur quinze ou vingt ans, et non par la solidité d’un groupe. La troisième : les risques changent avec la vie du projet. En construction, la question est de savoir si l’ouvrage sera livré à temps et au coût prévu ; en exploitation, elle devient celle des recettes, de la performance et des contreparties.</w:t>
+      </w:r>
+    </w:p>
+    <w:p>
+      <w:pPr>
+        <w:spacing w:after="140" w:line="300"/>
+      </w:pPr>
+      <w:r>
+        <w:rPr>
+          <w:b/>
+          <w:bCs/>
+        </w:rPr>
+        <w:t xml:space="preserve">Nos pratiques, ensuite, gagnent à être consolidées.</w:t>
+      </w:r>
+      <w:r>
+        <w:t xml:space="preserve"> Nous utilisons souvent des grilles conçues pour des entreprises, peu adaptées à ces dossiers. Le jugement d’expert reste central, et c’est une force, mais il est peu standardisé : deux analystes peuvent aboutir à deux notes différentes sur le même dossier, et il devient difficile de comparer une centrale solaire à une autoroute ou à un hôpital. Enfin, la justification de la note et sa traçabilité varient d’un dossier à l’autre.</w:t>
+      </w:r>
+    </w:p>
+    <w:p>
+      <w:pPr>
+        <w:spacing w:after="140" w:line="300"/>
+      </w:pPr>
+      <w:r>
+        <w:rPr>
+          <w:b/>
+          <w:bCs/>
+        </w:rPr>
+        <w:t xml:space="preserve">Enfin, les exigences montent.</w:t>
+      </w:r>
+      <w:r>
+        <w:t xml:space="preserve"> Le cadre bâlois fixe des critères précis pour la notation du financement de projet. Bank Al-Maghrib a publié des textes récents qui concernent directement ces dossiers, notamment sur la consortialisation des crédits et sur les risques climatiques des grands emprunteurs ; leur portée exacte est à confirmer avec la Conformité. Et les bailleurs internationaux qui cofinancent nos projets attendent le respect des normes environnementales et sociales de la SFI et de la BERD.</w:t>
       </w:r>
     </w:p>
     <w:p>
@@ -271,7 +271,7 @@
         <w:spacing w:after="60"/>
       </w:pPr>
       <w:r>
-        <w:t xml:space="preserve">Les exigences réglementaires et des bailleurs rendent cette homogénéité nécessaire.</w:t>
+        <w:t xml:space="preserve">Les exigences réglementaires et des bailleurs, y compris sur le climat, rendent cette homogénéité nécessaire.</w:t>
       </w:r>
     </w:p>
     <w:p>
@@ -336,85 +336,85 @@
           <w:b/>
           <w:bCs/>
         </w:rPr>
-        <w:t xml:space="preserve">Premier apport : une note reproductible. </w:t>
-      </w:r>
-      <w:r>
-        <w:t xml:space="preserve">Pour chaque critère, le modèle décrit quatre situations, de très favorable à critique, avec les pièces à vérifier. L’analyste ne note plus « à l’impression » : il choisit la situation qui décrit le dossier, preuves à l’appui. Deux analystes face au même dossier aboutissent ainsi à la même note.</w:t>
-      </w:r>
-    </w:p>
-    <w:p>
-      <w:pPr>
-        <w:spacing w:after="140" w:line="300"/>
-      </w:pPr>
-      <w:r>
-        <w:rPr>
-          <w:b/>
-          <w:bCs/>
-        </w:rPr>
-        <w:t xml:space="preserve">Deuxième apport : un modèle pensé pour le project finance. </w:t>
-      </w:r>
-      <w:r>
-        <w:t xml:space="preserve">Il tient compte de la phase du projet, du régime de ses recettes — un contrat ferme n’expose pas la banque comme des recettes de marché — et de douze secteurs, dont ceux qui comptent au Maroc : renouvelables, dessalement, transport, ports, santé, industrie, agro-industrie, tourisme, mines.</w:t>
-      </w:r>
-    </w:p>
-    <w:p>
-      <w:pPr>
-        <w:spacing w:after="140" w:line="300"/>
-      </w:pPr>
-      <w:r>
-        <w:rPr>
-          <w:b/>
-          <w:bCs/>
-        </w:rPr>
-        <w:t xml:space="preserve">Troisième apport : des garde-fous objectifs. </w:t>
-      </w:r>
-      <w:r>
-        <w:t xml:space="preserve">Quinze plafonds et douze verrous empêchent qu’une moyenne flatteuse masque un point de rupture. Un projet excellent sur le papier, mais dont la couverture de la dette tombe sous 1 en scénario défavorable, ne peut pas être bien noté.</w:t>
-      </w:r>
-    </w:p>
-    <w:p>
-      <w:pPr>
-        <w:spacing w:after="140" w:line="300"/>
-      </w:pPr>
-      <w:r>
-        <w:rPr>
-          <w:b/>
-          <w:bCs/>
-        </w:rPr>
-        <w:t xml:space="preserve">Quatrième apport : une analyse proportionnée. </w:t>
-      </w:r>
-      <w:r>
-        <w:t xml:space="preserve">Le modèle distingue trois régimes d’analyse — simplifié, standard, approfondi — selon la taille et la complexité du dossier. Un petit projet simple n’exige pas le même effort qu’une opération consortiale de plusieurs milliards.</w:t>
-      </w:r>
-    </w:p>
-    <w:p>
-      <w:pPr>
-        <w:spacing w:after="140" w:line="300"/>
-      </w:pPr>
-      <w:r>
-        <w:rPr>
-          <w:b/>
-          <w:bCs/>
-        </w:rPr>
-        <w:t xml:space="preserve">Cinquième apport : une décision traçable. </w:t>
-      </w:r>
-      <w:r>
-        <w:t xml:space="preserve">Chaque note se justifie par ses pièces et par les règles appliquées. Elle est auditable, et alignée sur Bâle, Bank Al-Maghrib, la SFI et la BERD.</w:t>
-      </w:r>
-    </w:p>
-    <w:p>
-      <w:pPr>
-        <w:spacing w:after="140" w:line="300"/>
-      </w:pPr>
-      <w:r>
-        <w:rPr>
-          <w:b/>
-          <w:bCs/>
-        </w:rPr>
-        <w:t xml:space="preserve">Sixième apport : un langage commun. </w:t>
-      </w:r>
-      <w:r>
-        <w:t xml:space="preserve">Le comité reçoit un grade sur l’échelle de la banque, avec les forces, les faiblesses et les conditions proposées. La discussion porte alors sur le fond du dossier, plus sur la façon dont la note a été obtenue.</w:t>
+        <w:t xml:space="preserve">Premier apport : une note reproductible.</w:t>
+      </w:r>
+      <w:r>
+        <w:t xml:space="preserve"> Pour chaque critère, le modèle décrit quatre situations, de très favorable à critique, avec les pièces à vérifier. L’analyste ne note plus « à l’impression » : il choisit la situation qui décrit le dossier, preuves à l’appui. Deux analystes face au même dossier aboutissent ainsi à la même note.</w:t>
+      </w:r>
+    </w:p>
+    <w:p>
+      <w:pPr>
+        <w:spacing w:after="140" w:line="300"/>
+      </w:pPr>
+      <w:r>
+        <w:rPr>
+          <w:b/>
+          <w:bCs/>
+        </w:rPr>
+        <w:t xml:space="preserve">Deuxième apport : un modèle pensé pour le project finance.</w:t>
+      </w:r>
+      <w:r>
+        <w:t xml:space="preserve"> Il tient compte de la phase du projet, du régime de ses recettes — un contrat ferme n’expose pas la banque comme des recettes de marché — et de douze secteurs, dont ceux qui comptent au Maroc : renouvelables, dessalement, transport, ports, santé, industrie, agro-industrie, tourisme, mines. Chaque secteur dispose désormais d’un scénario défavorable de référence pour le stress test.</w:t>
+      </w:r>
+    </w:p>
+    <w:p>
+      <w:pPr>
+        <w:spacing w:after="140" w:line="300"/>
+      </w:pPr>
+      <w:r>
+        <w:rPr>
+          <w:b/>
+          <w:bCs/>
+        </w:rPr>
+        <w:t xml:space="preserve">Troisième apport : des garde-fous objectifs.</w:t>
+      </w:r>
+      <w:r>
+        <w:t xml:space="preserve"> Dix-sept plafonds et douze verrous empêchent qu’une moyenne flatteuse masque un point de rupture. Un projet excellent sur le papier, mais dont la couverture de la dette tombe sous 1 en scénario défavorable, ne peut pas être bien noté.</w:t>
+      </w:r>
+    </w:p>
+    <w:p>
+      <w:pPr>
+        <w:spacing w:after="140" w:line="300"/>
+      </w:pPr>
+      <w:r>
+        <w:rPr>
+          <w:b/>
+          <w:bCs/>
+        </w:rPr>
+        <w:t xml:space="preserve">Quatrième apport : une analyse proportionnée.</w:t>
+      </w:r>
+      <w:r>
+        <w:t xml:space="preserve"> Le modèle distingue trois régimes d’analyse — simplifié, standard, approfondi — selon la taille et la complexité du dossier. Un petit projet simple n’exige pas le même effort qu’une opération consortiale de plusieurs milliards.</w:t>
+      </w:r>
+    </w:p>
+    <w:p>
+      <w:pPr>
+        <w:spacing w:after="140" w:line="300"/>
+      </w:pPr>
+      <w:r>
+        <w:rPr>
+          <w:b/>
+          <w:bCs/>
+        </w:rPr>
+        <w:t xml:space="preserve">Cinquième apport : une décision traçable.</w:t>
+      </w:r>
+      <w:r>
+        <w:t xml:space="preserve"> Chaque note se justifie par ses pièces et par les règles appliquées. L’IA lit les pièces du dossier — PDF, scans, documents Word, classeurs Excel — et propose plus de 300 champs de la saisie. Chaque valeur reprise affiche son origine sous le champ : la pièce, la page et le niveau de confiance. L’analyste accepte, corrige ou écarte ; s’il modifie une valeur, la valeur initiale reste lisible. La note est ainsi auditable, et alignée sur Bâle, Bank Al-Maghrib, la SFI et la BERD.</w:t>
+      </w:r>
+    </w:p>
+    <w:p>
+      <w:pPr>
+        <w:spacing w:after="140" w:line="300"/>
+      </w:pPr>
+      <w:r>
+        <w:rPr>
+          <w:b/>
+          <w:bCs/>
+        </w:rPr>
+        <w:t xml:space="preserve">Sixième apport : un langage commun.</w:t>
+      </w:r>
+      <w:r>
+        <w:t xml:space="preserve"> Le comité reçoit un grade sur l’échelle de la banque, avec les forces, les faiblesses et les conditions proposées. La discussion porte alors sur le fond du dossier, plus sur la façon dont la note a été obtenue.</w:t>
       </w:r>
     </w:p>
     <w:p>
@@ -453,7 +453,7 @@
         <w:spacing w:after="60"/>
       </w:pPr>
       <w:r>
-        <w:t xml:space="preserve">Spécificité : la phase, le régime de recettes et le secteur sont pris en compte.</w:t>
+        <w:t xml:space="preserve">Spécificité : la phase, le régime de recettes et le secteur sont pris en compte, jusque dans le stress test.</w:t>
       </w:r>
     </w:p>
     <w:p>
@@ -479,7 +479,7 @@
         <w:spacing w:after="60"/>
       </w:pPr>
       <w:r>
-        <w:t xml:space="preserve">Traçabilité : chaque note est justifiée et auditable.</w:t>
+        <w:t xml:space="preserve">Traçabilité : chaque note est justifiée ; chaque valeur proposée par l’IA garde sa source.</w:t>
       </w:r>
     </w:p>
     <w:p>
@@ -556,22 +556,22 @@
         <w:spacing w:after="140" w:line="300"/>
       </w:pPr>
       <w:r>
-        <w:t xml:space="preserve">Viennent ensuite le noyau financier, six indicateurs centrés sur la dette, puis la grille qualitative : vingt-cinq critères, pour lesquels l’analyste choisit une situation. L’ensemble donne un score sur 100, converti en note de 1 à 10 puis en grade.</w:t>
-      </w:r>
-    </w:p>
-    <w:p>
-      <w:pPr>
-        <w:spacing w:after="140" w:line="300"/>
-      </w:pPr>
-      <w:r>
-        <w:rPr>
-          <w:b/>
-          <w:bCs/>
-        </w:rPr>
-        <w:t xml:space="preserve">La cinquième étape est essentielle : les plafonds et les verrous. </w:t>
-      </w:r>
-      <w:r>
-        <w:t xml:space="preserve">La note approuvée est la plus basse entre la note calculée et les plafonds actifs. Une exclusion — par exemple une contrepartie sous sanctions — ne produit aucune note ; un blocage, comme un contrat de construction non signé, rend la note provisoire.</w:t>
+        <w:t xml:space="preserve">Viennent ensuite le noyau financier, six indicateurs centrés sur la dette, dont la couverture en scénario défavorable issue du stress test, puis la grille qualitative : vingt-cinq critères, pour lesquels l’analyste choisit une situation. L’ensemble donne un score sur 100, converti en note de 1 à 10 puis en grade.</w:t>
+      </w:r>
+    </w:p>
+    <w:p>
+      <w:pPr>
+        <w:spacing w:after="140" w:line="300"/>
+      </w:pPr>
+      <w:r>
+        <w:rPr>
+          <w:b/>
+          <w:bCs/>
+        </w:rPr>
+        <w:t xml:space="preserve">La cinquième étape est essentielle : les plafonds et les verrous.</w:t>
+      </w:r>
+      <w:r>
+        <w:t xml:space="preserve"> La note approuvée est la plus basse entre la note calculée et les plafonds actifs. Une exclusion — par exemple une contrepartie sous sanctions — ne produit aucune note ; un blocage, comme un contrat de construction non signé, rend la note provisoire.</w:t>
       </w:r>
     </w:p>
     <w:p>
@@ -652,10 +652,10 @@
           <w:b/>
           <w:bCs/>
         </w:rPr>
-        <w:t xml:space="preserve">Le point clé est que les poids changent avec la phase. </w:t>
-      </w:r>
-      <w:r>
-        <w:t xml:space="preserve">En construction, l’achèvement pèse 20 % de la note. En exploitation, ce risque a disparu : son poids tombe à zéro, et ce sont les recettes, l’exploitation et les contreparties qui prennent le relais, à 15 % chacune.</w:t>
+        <w:t xml:space="preserve">Le point clé est que les poids changent avec la phase.</w:t>
+      </w:r>
+      <w:r>
+        <w:t xml:space="preserve"> En construction, l’achèvement pèse 20 % de la note. En exploitation, ce risque a disparu : son poids tombe à zéro, et ce sont les recettes, l’exploitation et les contreparties qui prennent le relais, à 15 % chacune.</w:t>
       </w:r>
     </w:p>
     <w:p>
@@ -671,7 +671,7 @@
         <w:spacing w:after="140" w:line="300"/>
       </w:pPr>
       <w:r>
-        <w:t xml:space="preserve">Les neuf domaines regroupent vingt-cinq critères, chacun avec son poids et la liste des pièces à vérifier. Quatre d’entre eux ont une version adaptée à chaque secteur : la technologie, la structure des recettes, le marché et la performance technique.</w:t>
+        <w:t xml:space="preserve">Les neuf domaines regroupent vingt-cinq critères, chacun avec son poids et la liste des pièces à vérifier. Quatre d’entre eux ont une version adaptée à chaque secteur : la technologie, la structure des recettes, le marché et la performance technique. Le domaine ESG et climat, D9, reste à 5 % du score ; avec le lot 2 du volet climatique, il recevra un cinquième critère, calculé, sur le risque de transition. J’y reviendrai.</w:t>
       </w:r>
     </w:p>
     <w:p>
@@ -752,25 +752,25 @@
           <w:b/>
           <w:bCs/>
         </w:rPr>
-        <w:t xml:space="preserve">Un choix important : on retient le DSCR minimum, pas la moyenne. </w:t>
-      </w:r>
-      <w:r>
-        <w:t xml:space="preserve">Un seul semestre trop faible suffit à mettre la banque en difficulté.</w:t>
-      </w:r>
-    </w:p>
-    <w:p>
-      <w:pPr>
-        <w:spacing w:after="140" w:line="300"/>
-      </w:pPr>
-      <w:r>
-        <w:rPr>
-          <w:b/>
-          <w:bCs/>
-        </w:rPr>
-        <w:t xml:space="preserve">Les seuils dépendent du régime de recettes. </w:t>
-      </w:r>
-      <w:r>
-        <w:t xml:space="preserve">Un projet sous contrat ferme est jugé satisfaisant à partir de 1,30 ; un projet exposé au marché doit atteindre 1,80. On ajoute un écart propre au secteur, de −0,05 pour les renouvelables à +0,25 pour les mines, et une majoration de 0,05 pendant la montée en charge. Pour un hôtel en montée en charge, le seuil critique est ainsi de 1,35 + 0,20 + 0,05, soit 1,60.</w:t>
+        <w:t xml:space="preserve">Un choix important : on retient le DSCR minimum, pas la moyenne.</w:t>
+      </w:r>
+      <w:r>
+        <w:t xml:space="preserve"> Un seul semestre trop faible suffit à mettre la banque en difficulté.</w:t>
+      </w:r>
+    </w:p>
+    <w:p>
+      <w:pPr>
+        <w:spacing w:after="140" w:line="300"/>
+      </w:pPr>
+      <w:r>
+        <w:rPr>
+          <w:b/>
+          <w:bCs/>
+        </w:rPr>
+        <w:t xml:space="preserve">Les seuils dépendent du régime de recettes.</w:t>
+      </w:r>
+      <w:r>
+        <w:t xml:space="preserve"> Un projet sous contrat ferme est jugé satisfaisant à partir de 1,30 ; un projet exposé au marché doit atteindre 1,80. On ajoute un écart propre au secteur, de −0,05 pour les renouvelables à +0,25 pour les mines, et une majoration de 0,05 pendant la montée en charge. Pour un hôtel en montée en charge, le seuil critique est ainsi de 1,35 + 0,20 + 0,05, soit 1,60.</w:t>
       </w:r>
     </w:p>
     <w:p>
@@ -794,7 +794,7 @@
           <w:i/>
           <w:iCs/>
         </w:rPr>
-        <w:t xml:space="preserve">Reste à voir comment les garde-fous encadrent la note finale.</w:t>
+        <w:t xml:space="preserve">Le deuxième indicateur, le DSCR en scénario défavorable, repose sur un stress test. Voyons comment il se construit.</w:t>
       </w:r>
     </w:p>
     <w:p>
@@ -802,7 +802,7 @@
         <w:pStyle w:val="Heading1"/>
       </w:pPr>
       <w:r>
-        <w:t xml:space="preserve">7. Des garde-fous encadrent la note finale</w:t>
+        <w:t xml:space="preserve">7. Stress test : du scénario au choc</w:t>
       </w:r>
     </w:p>
     <w:p>
@@ -823,39 +823,113 @@
           <w:iCs/>
           <w:color w:val="3D4A5C"/>
         </w:rPr>
-        <w:t xml:space="preserve">   ·   environ 2 minutes</w:t>
-      </w:r>
-    </w:p>
-    <w:p>
-      <w:pPr>
-        <w:spacing w:after="140" w:line="300"/>
-      </w:pPr>
-      <w:r>
-        <w:t xml:space="preserve">Les plafonds sont quinze faits objectifs qui limitent la note, quelle que soit la moyenne. Un DSCR inférieur à 1,05 sur une seule échéance limite la note à 3 ; un DSCR inférieur à 1 en scénario défavorable, ou un LLCR inférieur à 1,10, la limite à 4 ; une dette dépassant 85 % du financement, à 5 ; une réserve de service de la dette inférieure à trois mois, à 6.</w:t>
-      </w:r>
-    </w:p>
-    <w:p>
-      <w:pPr>
-        <w:spacing w:after="140" w:line="300"/>
-      </w:pPr>
-      <w:r>
-        <w:t xml:space="preserve">L’analyste ne choisit pas ces plafonds : ils se déclenchent à partir des données saisies. C’est ce qui rend la note robuste et difficile à contester.</w:t>
-      </w:r>
-    </w:p>
-    <w:p>
-      <w:pPr>
-        <w:spacing w:after="140" w:line="300"/>
-      </w:pPr>
-      <w:r>
-        <w:t xml:space="preserve">Les verrous vont plus loin. Les exclusions — activité interdite, contrepartie sous sanctions, défaut avéré — empêchent toute note. Les blocages laissent la note provisoire et indiquent le stade bloqué : l’octroi, le décaissement ou la validation de la notation.</w:t>
-      </w:r>
-    </w:p>
-    <w:p>
-      <w:pPr>
-        <w:spacing w:after="140" w:line="300"/>
-      </w:pPr>
-      <w:r>
-        <w:t xml:space="preserve">Enfin, le score se convertit en note puis en grade : de 92 points et plus pour une note de 10, soit AAA, jusqu’à moins de 32 points pour une note de 1, soit D. Cette correspondance un pour un reste à confirmer avec l’échelle interne de la banque.</w:t>
+        <w:t xml:space="preserve">   ·   environ 2 minutes 30</w:t>
+      </w:r>
+    </w:p>
+    <w:p>
+      <w:pPr>
+        <w:spacing w:after="140" w:line="300"/>
+      </w:pPr>
+      <w:r>
+        <w:t xml:space="preserve">Le stress test pose une question simple : si le principal risque du projet se matérialise, les flux suffisent-ils encore à payer la dette ? Le modèle y répond en recalculant le DSCR dans un scénario défavorable ; c’est l’indicateur N2, qui pèse 20 % du noyau.</w:t>
+      </w:r>
+    </w:p>
+    <w:p>
+      <w:pPr>
+        <w:spacing w:after="140" w:line="300"/>
+      </w:pPr>
+      <w:r>
+        <w:rPr>
+          <w:b/>
+          <w:bCs/>
+        </w:rPr>
+        <w:t xml:space="preserve">Première évolution : une bibliothèque de scénarios de référence.</w:t>
+      </w:r>
+      <w:r>
+        <w:t xml:space="preserve"> Pour chacun des douze secteurs, l’outil propose le risque qui fait le plus bouger les flux, une baisse des recettes, une hausse des charges et la source de ces hypothèses. Pour les renouvelables, production P90 à un an, soit −8 %, et charges +10 % ; pour le transport, trafic −15 % et charges +10 % ; pour les mines, prix du métal −25 % et coûts +8 %. L’analyste part de ce scénario, l’adapte au projet et justifie tout écart dans sa description. Ces valeurs sont candidates et seront calibrées avec vous.</w:t>
+      </w:r>
+    </w:p>
+    <w:p>
+      <w:pPr>
+        <w:spacing w:after="140" w:line="300"/>
+      </w:pPr>
+      <w:r>
+        <w:rPr>
+          <w:b/>
+          <w:bCs/>
+        </w:rPr>
+        <w:t xml:space="preserve">Seconde évolution : le passage du scénario au choc.</w:t>
+      </w:r>
+      <w:r>
+        <w:t xml:space="preserve"> Le choc est la baisse relative des flux disponibles pour la dette, les CFADS : choc = (recettes perdues + charges supplémentaires) ÷ CFADS central. Prenons des recettes de 100 et des charges de 25 : le CFADS central est de 75. Avec −8 % sur les recettes et +10 % sur les charges, on perd 8 de recettes et on paie 2,5 de charges en plus : le CFADS stressé tombe à 64,5, et le choc vaut 10,5 ÷ 75, soit 14 %.</w:t>
+      </w:r>
+    </w:p>
+    <w:p>
+      <w:pPr>
+        <w:spacing w:after="140" w:line="300"/>
+      </w:pPr>
+      <w:r>
+        <w:t xml:space="preserve">Le service de la dette, lui, ne change pas : la banque attend les mêmes échéances. Le DSCR stressé est donc le DSCR central multiplié par (1 − choc). Un DSCR central de 1,29 devient 1,29 × 0,86, soit 1,11. Ce DSCR stressé minimum est classé avec les mêmes seuils que le DSCR central ; s’il passe sous 1,00, le plafond C3 limite la note à 4, quel que soit le score.</w:t>
+      </w:r>
+    </w:p>
+    <w:p>
+      <w:pPr>
+        <w:spacing w:after="140" w:line="300"/>
+      </w:pPr>
+      <w:r>
+        <w:t xml:space="preserve">Si le modèle financier du projet fournit un CFADS stressé échéance par échéance, il remplace le choc sur ces échéances. Et le choc calculé par l’outil garde son origine dans la saisie, comme les valeurs proposées par l’IA.</w:t>
+      </w:r>
+    </w:p>
+    <w:p>
+      <w:pPr>
+        <w:spacing w:after="60" w:before="120"/>
+      </w:pPr>
+      <w:r>
+        <w:rPr>
+          <w:b/>
+          <w:bCs/>
+          <w:color w:val="14213D"/>
+        </w:rPr>
+        <w:t xml:space="preserve">À retenir</w:t>
+      </w:r>
+    </w:p>
+    <w:p>
+      <w:pPr>
+        <w:pStyle w:val="ListParagraph"/>
+        <w:numPr>
+          <w:ilvl w:val="0"/>
+          <w:numId w:val="2"/>
+        </w:numPr>
+        <w:spacing w:after="60"/>
+      </w:pPr>
+      <w:r>
+        <w:t xml:space="preserve">Un scénario de référence par secteur, sourcé, que l’analyste adapte en le justifiant.</w:t>
+      </w:r>
+    </w:p>
+    <w:p>
+      <w:pPr>
+        <w:pStyle w:val="ListParagraph"/>
+        <w:numPr>
+          <w:ilvl w:val="0"/>
+          <w:numId w:val="2"/>
+        </w:numPr>
+        <w:spacing w:after="60"/>
+      </w:pPr>
+      <w:r>
+        <w:t xml:space="preserve">Choc = (recettes perdues + charges supplémentaires) ÷ CFADS central ; DSCR stressé = DSCR central × (1 − choc).</w:t>
+      </w:r>
+    </w:p>
+    <w:p>
+      <w:pPr>
+        <w:pStyle w:val="ListParagraph"/>
+        <w:numPr>
+          <w:ilvl w:val="0"/>
+          <w:numId w:val="2"/>
+        </w:numPr>
+        <w:spacing w:after="60"/>
+      </w:pPr>
+      <w:r>
+        <w:t xml:space="preserve">Exemple : CFADS 75 → 64,5, choc 14 %, DSCR 1,29 → 1,11 ; sous 1,00, plafond C3 (note maximale 4).</w:t>
       </w:r>
     </w:p>
     <w:p>
@@ -879,7 +953,7 @@
           <w:i/>
           <w:iCs/>
         </w:rPr>
-        <w:t xml:space="preserve">Voyons le modèle à l’œuvre sur deux cas fictifs.</w:t>
+        <w:t xml:space="preserve">Ce plafond C3 n’est qu’un des garde-fous qui encadrent la note finale.</w:t>
       </w:r>
     </w:p>
     <w:p>
@@ -887,7 +961,7 @@
         <w:pStyle w:val="Heading1"/>
       </w:pPr>
       <w:r>
-        <w:t xml:space="preserve">8. Deux exemples : solaire et dessalement</w:t>
+        <w:t xml:space="preserve">8. Des garde-fous encadrent la note finale</w:t>
       </w:r>
     </w:p>
     <w:p>
@@ -916,37 +990,46 @@
         <w:spacing w:after="140" w:line="300"/>
       </w:pPr>
       <w:r>
-        <w:rPr>
-          <w:b/>
-          <w:bCs/>
-        </w:rPr>
-        <w:t xml:space="preserve">Centrale solaire de 80 MWc, en construction. </w:t>
-      </w:r>
-      <w:r>
-        <w:t xml:space="preserve">Les recettes sont garanties par un contrat d’achat de 25 ans à quantité garantie (régime take-or-pay). Le DSCR minimum atteint 1,30 pour un seuil favorable de 1,25 ; en scénario défavorable, production P90 et charges en hausse de 10 %, il reste à 1,12, en vigilance. La dette représente 66 % du financement. Aucun plafond ne se déclenche : le score de 86,3 donne une note de 9, soit AA, avec des conditions minimales.</w:t>
-      </w:r>
-    </w:p>
-    <w:p>
-      <w:pPr>
-        <w:spacing w:after="140" w:line="300"/>
-      </w:pPr>
-      <w:r>
-        <w:rPr>
-          <w:b/>
-          <w:bCs/>
-        </w:rPr>
-        <w:t xml:space="preserve">Usine de dessalement de 100 000 m³ par jour, en montée en charge. </w:t>
-      </w:r>
-      <w:r>
-        <w:t xml:space="preserve">Elle est rémunérée par une redevance de disponibilité, mais 35 % de la dette est en euros et l’opération est consortiale, au sens de la directive 3/W/2025. Le DSCR minimum de 1,23 est sous le seuil de vigilance de 1,27 ; en scénario défavorable (énergie en hausse de 15 %, répercutée à 60 % seulement), il tombe à 1,09, en zone critique. Le score de 67,7 donne une note de 6, soit BB : le dossier est acceptable, sous conditions, notamment une couverture de change et une réserve de service de la dette renforcée.</w:t>
-      </w:r>
-    </w:p>
-    <w:p>
-      <w:pPr>
-        <w:spacing w:after="140" w:line="300"/>
-      </w:pPr>
-      <w:r>
-        <w:t xml:space="preserve">Le contraste est instructif : deux projets d’infrastructure, deux structures de recettes, et le modèle explique précisément pourquoi l’un est AA et l’autre BB.</w:t>
+        <w:t xml:space="preserve">Les plafonds sont désormais dix-sept faits objectifs, de C1 à C17, qui limitent la note quelle que soit la moyenne. Un DSCR inférieur à 1,05 sur une seule échéance limite la note à 3 ; un DSCR inférieur à 1 en scénario défavorable, ou un LLCR inférieur à 1,10, la limite à 4 ; une dette dépassant 85 % du financement, à 5 ; une réserve de service de la dette inférieure à trois mois, à 6.</w:t>
+      </w:r>
+    </w:p>
+    <w:p>
+      <w:pPr>
+        <w:spacing w:after="140" w:line="300"/>
+      </w:pPr>
+      <w:r>
+        <w:rPr>
+          <w:b/>
+          <w:bCs/>
+        </w:rPr>
+        <w:t xml:space="preserve">Trois plafonds concernent le climat.</w:t>
+      </w:r>
+      <w:r>
+        <w:t xml:space="preserve"> Le plafond C11 existe déjà : un site à risque climatique physique élevé sans plan d’adaptation financé limite la note à 6. Le volet climatique en ajoute deux : C16, un risque de transition élevé sans plan de transition crédible, note maximale 6 ; et C17, au moins deux aléas climatiques élevés sans adaptation financée, note maximale 5. C16 et C17, comme la version révisée de C11, ne s’appliquent qu’une fois le lot 2 activé.</w:t>
+      </w:r>
+    </w:p>
+    <w:p>
+      <w:pPr>
+        <w:spacing w:after="140" w:line="300"/>
+      </w:pPr>
+      <w:r>
+        <w:t xml:space="preserve">L’analyste ne choisit pas ces plafonds : ils se déclenchent à partir des données saisies. C’est ce qui rend la note robuste et difficile à contester.</w:t>
+      </w:r>
+    </w:p>
+    <w:p>
+      <w:pPr>
+        <w:spacing w:after="140" w:line="300"/>
+      </w:pPr>
+      <w:r>
+        <w:t xml:space="preserve">Les verrous vont plus loin. Les exclusions — activité interdite, contrepartie sous sanctions, défaut avéré — empêchent toute note. Les blocages laissent la note provisoire et indiquent le stade bloqué : l’octroi, le décaissement ou la validation de la notation.</w:t>
+      </w:r>
+    </w:p>
+    <w:p>
+      <w:pPr>
+        <w:spacing w:after="140" w:line="300"/>
+      </w:pPr>
+      <w:r>
+        <w:t xml:space="preserve">Enfin, le score se convertit en note puis en grade : de 92 points et plus pour une note de 10, soit AAA, jusqu’à moins de 32 points pour une note de 1, soit D. Cette correspondance un pour un reste à confirmer avec l’échelle interne de la banque.</w:t>
       </w:r>
     </w:p>
     <w:p>
@@ -970,6 +1053,284 @@
           <w:i/>
           <w:iCs/>
         </w:rPr>
+        <w:t xml:space="preserve">Arrêtons-nous justement sur le volet climatique.</w:t>
+      </w:r>
+    </w:p>
+    <w:p>
+      <w:pPr>
+        <w:pStyle w:val="Heading1"/>
+      </w:pPr>
+      <w:r>
+        <w:t xml:space="preserve">9. Le volet climatique, en deux lots</w:t>
+      </w:r>
+    </w:p>
+    <w:p>
+      <w:pPr>
+        <w:spacing w:after="100"/>
+      </w:pPr>
+      <w:r>
+        <w:rPr>
+          <w:b/>
+          <w:bCs/>
+          <w:color w:val="B8862E"/>
+        </w:rPr>
+        <w:t xml:space="preserve">Diapositive 9</w:t>
+      </w:r>
+      <w:r>
+        <w:rPr>
+          <w:i/>
+          <w:iCs/>
+          <w:color w:val="3D4A5C"/>
+        </w:rPr>
+        <w:t xml:space="preserve">   ·   environ 2 minutes 30</w:t>
+      </w:r>
+    </w:p>
+    <w:p>
+      <w:pPr>
+        <w:spacing w:after="140" w:line="300"/>
+      </w:pPr>
+      <w:r>
+        <w:t xml:space="preserve">Le volet climatique répond à la directive 2/W/2025 de Bank Al-Maghrib sur les risques climatiques et aux attentes des bailleurs. Nous l’avons découpé en deux lots, pour ne pas changer la note avant que le comité ait validé les règles.</w:t>
+      </w:r>
+    </w:p>
+    <w:p>
+      <w:pPr>
+        <w:spacing w:after="140" w:line="300"/>
+      </w:pPr>
+      <w:r>
+        <w:rPr>
+          <w:b/>
+          <w:bCs/>
+        </w:rPr>
+        <w:t xml:space="preserve">Le lot 1 est en service, sans effet sur la note.</w:t>
+      </w:r>
+      <w:r>
+        <w:t xml:space="preserve"> Chaque dossier a une fiche climat. Pour les risques physiques, six aléas — chaleur extrême, stress hydrique et sécheresse, inondation, submersion marine, feux de forêt, tempêtes et vents — sont présélectionnés selon le secteur ; l’analyste note chacun faible, moyen ou élevé, cite sa source et indique si une adaptation est financée. Pour le risque de transition, il renseigne les émissions, les exportations soumises au mécanisme d’ajustement carbone aux frontières européen, le MACF, la dépendance aux énergies fossiles et l’existence d’un plan de transition. S’y ajoutent un scénario climatique indicatif et la fiche des données attendues par la directive 2/W/2025.</w:t>
+      </w:r>
+    </w:p>
+    <w:p>
+      <w:pPr>
+        <w:spacing w:after="140" w:line="300"/>
+      </w:pPr>
+      <w:r>
+        <w:rPr>
+          <w:b/>
+          <w:bCs/>
+        </w:rPr>
+        <w:t xml:space="preserve">Le lot 2 est intégré à l’outil, mais inactif.</w:t>
+      </w:r>
+      <w:r>
+        <w:t xml:space="preserve"> C’est un interrupteur du paramétrage, à activer après validation du comité et alignement de l’outil Excel. Une fois activé, l’exposition du site est déduite des aléas — un aléa élevé suffit — au lieu de la seule case déclarée. Le plafond C11 se déclenche aléa par aléa, dès qu’un aléa élevé n’a pas d’adaptation financée ; C16 et C17 s’ajoutent. Le domaine D9 reçoit un sous-critère calculé, D9.5 « risque de transition », à 15 % du domaine ; les autres sous-critères passent à 25 % pour l’environnement, 25 % pour le social, 10 % pour la gouvernance ESG et 25 % pour les risques physiques résiduels. Enfin, sur un site exposé, N2 retient le plus sévère du scénario financier et du scénario climatique.</w:t>
+      </w:r>
+    </w:p>
+    <w:p>
+      <w:pPr>
+        <w:spacing w:after="140" w:line="300"/>
+      </w:pPr>
+      <w:r>
+        <w:t xml:space="preserve">Pour le risque de transition, deux repères : au-delà de 25 000 tonnes équivalent CO₂ par an, seuil de quantification de la norme de performance 3 de la SFI, le risque est moyen ; au-delà de 100 000 tonnes, seuil d’analyse des alternatives des Principes de l’Équateur, ou quand les exportations soumises au MACF atteignent 20 % du chiffre d’affaires, il est élevé.</w:t>
+      </w:r>
+    </w:p>
+    <w:p>
+      <w:pPr>
+        <w:spacing w:after="140" w:line="300"/>
+      </w:pPr>
+      <w:r>
+        <w:rPr>
+          <w:b/>
+          <w:bCs/>
+        </w:rPr>
+        <w:t xml:space="preserve">Nous avons mesuré l’impact du lot 2 sur les 18 cas fictifs.</w:t>
+      </w:r>
+      <w:r>
+        <w:t xml:space="preserve"> Une seule note change : l’huilerie d’olives passe de 8 à 6, car la sécheresse devient un aléa élevé sans adaptation et le scénario de deux campagnes sèches devient le stress le plus sévère. Huit dossiers prennent au moins un plafond climatique, le plus souvent sans changement de note parce qu’ils étaient déjà plafonnés au même niveau ou plus bas : le risque devient visible et justifié. Dix dossiers ont une exposition retenue différente de la case déclarée : la case sous-estimait l’exposition. Enfin, l’adaptation est récompensée : la centrale solaire et l’usine de dessalement, exposées mais adaptées, ne prennent aucun plafond.</w:t>
+      </w:r>
+    </w:p>
+    <w:p>
+      <w:pPr>
+        <w:spacing w:after="60" w:before="120"/>
+      </w:pPr>
+      <w:r>
+        <w:rPr>
+          <w:b/>
+          <w:bCs/>
+          <w:color w:val="14213D"/>
+        </w:rPr>
+        <w:t xml:space="preserve">À retenir</w:t>
+      </w:r>
+    </w:p>
+    <w:p>
+      <w:pPr>
+        <w:pStyle w:val="ListParagraph"/>
+        <w:numPr>
+          <w:ilvl w:val="0"/>
+          <w:numId w:val="2"/>
+        </w:numPr>
+        <w:spacing w:after="60"/>
+      </w:pPr>
+      <w:r>
+        <w:t xml:space="preserve">Lot 1 : la fiche climat est collectée et analysée, sans effet sur la note.</w:t>
+      </w:r>
+    </w:p>
+    <w:p>
+      <w:pPr>
+        <w:pStyle w:val="ListParagraph"/>
+        <w:numPr>
+          <w:ilvl w:val="0"/>
+          <w:numId w:val="2"/>
+        </w:numPr>
+        <w:spacing w:after="60"/>
+      </w:pPr>
+      <w:r>
+        <w:t xml:space="preserve">Lot 2 : exposition déduite des aléas, C11 révisé, C16 et C17, D9.5 à 15 % de D9, scénario climatique dans N2 ; inactif par défaut.</w:t>
+      </w:r>
+    </w:p>
+    <w:p>
+      <w:pPr>
+        <w:pStyle w:val="ListParagraph"/>
+        <w:numPr>
+          <w:ilvl w:val="0"/>
+          <w:numId w:val="2"/>
+        </w:numPr>
+        <w:spacing w:after="60"/>
+      </w:pPr>
+      <w:r>
+        <w:t xml:space="preserve">Impact sur les 18 cas : une note modifiée, huit dossiers avec un plafond climatique, dix expositions corrigées.</w:t>
+      </w:r>
+    </w:p>
+    <w:p>
+      <w:pPr>
+        <w:pStyle w:val="ListParagraph"/>
+        <w:numPr>
+          <w:ilvl w:val="0"/>
+          <w:numId w:val="2"/>
+        </w:numPr>
+        <w:spacing w:after="60"/>
+      </w:pPr>
+      <w:r>
+        <w:t xml:space="preserve">Le dossier de validation du lot 2 est soumis au comité de validation du modèle.</w:t>
+      </w:r>
+    </w:p>
+    <w:p>
+      <w:pPr>
+        <w:pBdr>
+          <w:left w:val="single" w:color="B8862E" w:sz="12" w:space="8"/>
+        </w:pBdr>
+        <w:spacing w:after="240" w:before="120"/>
+        <w:ind w:left="160"/>
+      </w:pPr>
+      <w:r>
+        <w:rPr>
+          <w:b/>
+          <w:bCs/>
+          <w:color w:val="B8862E"/>
+        </w:rPr>
+        <w:t xml:space="preserve">Transition — </w:t>
+      </w:r>
+      <w:r>
+        <w:rPr>
+          <w:i/>
+          <w:iCs/>
+        </w:rPr>
+        <w:t xml:space="preserve">Voyons pour finir le modèle à l’œuvre sur deux cas fictifs.</w:t>
+      </w:r>
+    </w:p>
+    <w:p>
+      <w:pPr>
+        <w:pStyle w:val="Heading1"/>
+      </w:pPr>
+      <w:r>
+        <w:t xml:space="preserve">10. Deux exemples : solaire et dessalement</w:t>
+      </w:r>
+    </w:p>
+    <w:p>
+      <w:pPr>
+        <w:spacing w:after="100"/>
+      </w:pPr>
+      <w:r>
+        <w:rPr>
+          <w:b/>
+          <w:bCs/>
+          <w:color w:val="B8862E"/>
+        </w:rPr>
+        <w:t xml:space="preserve">Diapositive 10</w:t>
+      </w:r>
+      <w:r>
+        <w:rPr>
+          <w:i/>
+          <w:iCs/>
+          <w:color w:val="3D4A5C"/>
+        </w:rPr>
+        <w:t xml:space="preserve">   ·   environ 2 minutes</w:t>
+      </w:r>
+    </w:p>
+    <w:p>
+      <w:pPr>
+        <w:spacing w:after="140" w:line="300"/>
+      </w:pPr>
+      <w:r>
+        <w:rPr>
+          <w:b/>
+          <w:bCs/>
+        </w:rPr>
+        <w:t xml:space="preserve">Centrale solaire de 80 MWc, en construction.</w:t>
+      </w:r>
+      <w:r>
+        <w:t xml:space="preserve"> Les recettes sont garanties par un contrat d’achat de 25 ans à quantité garantie (régime take-or-pay). Le DSCR minimum atteint 1,30 pour un seuil favorable de 1,25 ; dans le scénario de référence du secteur, production P90 et charges en hausse de 10 %, il reste à 1,12, en vigilance. La dette représente 66 % du financement. Aucun plafond ne se déclenche : le score de 86,3 donne une note de 9, soit AA, avec des conditions minimales.</w:t>
+      </w:r>
+    </w:p>
+    <w:p>
+      <w:pPr>
+        <w:spacing w:after="140" w:line="300"/>
+      </w:pPr>
+      <w:r>
+        <w:rPr>
+          <w:b/>
+          <w:bCs/>
+        </w:rPr>
+        <w:t xml:space="preserve">Usine de dessalement de 100 000 m³ par jour, en montée en charge.</w:t>
+      </w:r>
+      <w:r>
+        <w:t xml:space="preserve"> Elle est rémunérée par une redevance de disponibilité, mais 35 % de la dette est en euros et l’opération est consortiale, au sens de la directive 3/W/2025. Le DSCR minimum de 1,23 est sous le seuil de vigilance de 1,27 ; en scénario défavorable (énergie en hausse de 15 %, répercutée à 60 % seulement), il tombe à 1,09, en zone critique. Le score de 67,7 donne une note de 6, soit BB : le dossier est acceptable, sous conditions, notamment une couverture de change et une réserve de service de la dette renforcée.</w:t>
+      </w:r>
+    </w:p>
+    <w:p>
+      <w:pPr>
+        <w:spacing w:after="140" w:line="300"/>
+      </w:pPr>
+      <w:r>
+        <w:t xml:space="preserve">Côté climat, les deux sites sont exposés — chaleur extrême pour l’un, vents violents pour l’autre — mais leurs aléas élevés sont couverts par une adaptation financée : avec le lot 2, aucun plafond climatique ne s’ajoute et leurs notes ne changent pas.</w:t>
+      </w:r>
+    </w:p>
+    <w:p>
+      <w:pPr>
+        <w:spacing w:after="140" w:line="300"/>
+      </w:pPr>
+      <w:r>
+        <w:t xml:space="preserve">Le contraste est instructif : deux projets d’infrastructure, deux structures de recettes, et le modèle explique précisément pourquoi l’un est AA et l’autre BB.</w:t>
+      </w:r>
+    </w:p>
+    <w:p>
+      <w:pPr>
+        <w:pBdr>
+          <w:left w:val="single" w:color="B8862E" w:sz="12" w:space="8"/>
+        </w:pBdr>
+        <w:spacing w:after="240" w:before="120"/>
+        <w:ind w:left="160"/>
+      </w:pPr>
+      <w:r>
+        <w:rPr>
+          <w:b/>
+          <w:bCs/>
+          <w:color w:val="B8862E"/>
+        </w:rPr>
+        <w:t xml:space="preserve">Transition — </w:t>
+      </w:r>
+      <w:r>
+        <w:rPr>
+          <w:i/>
+          <w:iCs/>
+        </w:rPr>
         <w:t xml:space="preserve">Pour conclure…</w:t>
       </w:r>
     </w:p>
@@ -991,7 +1352,7 @@
           <w:bCs/>
           <w:color w:val="B8862E"/>
         </w:rPr>
-        <w:t xml:space="preserve">Diapositive 8 (suite)</w:t>
+        <w:t xml:space="preserve">Diapositive 10 (suite)</w:t>
       </w:r>
       <w:r>
         <w:rPr>
@@ -1015,15 +1376,23 @@
         <w:spacing w:after="140" w:line="300"/>
       </w:pPr>
       <w:r>
-        <w:t xml:space="preserve">Il ne remplace pas le jugement de l’analyste ni celui du comité : il le structure. Il dit ce qu’il faut regarder, avec quelles preuves, et il empêche qu’une faiblesse majeure passe inaperçue.</w:t>
-      </w:r>
-    </w:p>
-    <w:p>
-      <w:pPr>
-        <w:spacing w:after="140" w:line="300"/>
-      </w:pPr>
-      <w:r>
-        <w:t xml:space="preserve">Les paramètres que je vous ai présentés sont des propositions. Votre expérience est précieuse pour les calibrer : c’est l’objet de la discussion qui suit. Je vous remercie de votre attention et je suis à votre disposition pour vos questions.</w:t>
+        <w:t xml:space="preserve">Les évolutions récentes vont dans le même sens. Le stress test repose sur des scénarios de référence sourcés et sur un calcul du choc explicite. Le volet climatique est collecté dès aujourd’hui et pourra entrer dans la note dès que le comité l’aura validé, avec un impact mesuré et limité. Et chaque valeur proposée par l’IA reste rattachée à sa pièce.</w:t>
+      </w:r>
+    </w:p>
+    <w:p>
+      <w:pPr>
+        <w:spacing w:after="140" w:line="300"/>
+      </w:pPr>
+      <w:r>
+        <w:t xml:space="preserve">Le modèle ne remplace pas le jugement de l’analyste ni celui du comité : il le structure. Il dit ce qu’il faut regarder, avec quelles preuves, et il empêche qu’une faiblesse majeure passe inaperçue.</w:t>
+      </w:r>
+    </w:p>
+    <w:p>
+      <w:pPr>
+        <w:spacing w:after="140" w:line="300"/>
+      </w:pPr>
+      <w:r>
+        <w:t xml:space="preserve">Les paramètres que je vous ai présentés, y compris les scénarios de stress et les règles du lot 2, sont des propositions. Votre expérience est précieuse pour les calibrer : c’est l’objet de la discussion qui suit. Je vous remercie de votre attention et je suis à votre disposition pour vos questions.</w:t>
       </w:r>
     </w:p>
     <w:sectPr>

</xml_diff>